<commit_message>
Add new markdown and DOCX files to test corpus
- Created a new markdown file with a simple title and list in `2026-08-07T09-57-57-553Z/plain.md`.
- Added a new DOCX file containing binary data in `2026-08-07T09-57-57-710Z/ab.docx`.
- Introduced a new markdown file with a Mermaid diagram in `2026-08-07T09-57-57-710Z/ab.md`.
</commit_message>
<xml_diff>
--- a/test-corpus/output/word-group.docx
+++ b/test-corpus/output/word-group.docx
@@ -4,8 +4,13 @@
   <w:body>
     <w:p>
       <w:r>
-        <w:t>Test diagram</w:t>
+        <w:t xml:space="preserve">Test </w:t>
       </w:r>
+      <w:proofErr w:type="spellStart"/>
+      <w:r>
+        <w:t>diagram</w:t>
+      </w:r>
+      <w:proofErr w:type="spellEnd"/>
     </w:p>
     <w:p>
       <w:r>
@@ -15,7 +20,7 @@
         <mc:AlternateContent>
           <mc:Choice Requires="wpc">
             <w:drawing>
-              <wp:anchor distT="0" distB="0" distL="114300" distR="114300" simplePos="0" relativeHeight="251659264" behindDoc="0" locked="0" layoutInCell="1" allowOverlap="1" wp14:anchorId="47B3DCE6" wp14:editId="448255A5">
+              <wp:anchor distT="0" distB="0" distL="114300" distR="114300" simplePos="0" relativeHeight="251659264" behindDoc="0" locked="0" layoutInCell="1" allowOverlap="1" wp14:anchorId="47B3DCE6" wp14:editId="286E34E8">
                 <wp:simplePos x="0" y="0"/>
                 <wp:positionH relativeFrom="column">
                   <wp:posOffset>370205</wp:posOffset>
@@ -151,6 +156,37 @@
                           </wps:bodyPr>
                         </wps:wsp>
                       </wpg:wgp>
+                      <wps:wsp>
+                        <wps:cNvPr id="1539593676" name="Connecteur droit 1539593676"/>
+                        <wps:cNvCnPr>
+                          <a:stCxn id="979965921" idx="2"/>
+                          <a:endCxn id="1200520322" idx="0"/>
+                        </wps:cNvCnPr>
+                        <wps:spPr>
+                          <a:xfrm>
+                            <a:off x="889000" y="889000"/>
+                            <a:ext cx="0" cy="381000"/>
+                          </a:xfrm>
+                          <a:prstGeom prst="line">
+                            <a:avLst/>
+                          </a:prstGeom>
+                        </wps:spPr>
+                        <wps:style>
+                          <a:lnRef idx="2">
+                            <a:schemeClr val="accent1"/>
+                          </a:lnRef>
+                          <a:fillRef idx="0">
+                            <a:schemeClr val="accent1"/>
+                          </a:fillRef>
+                          <a:effectRef idx="1">
+                            <a:schemeClr val="accent1"/>
+                          </a:effectRef>
+                          <a:fontRef idx="minor">
+                            <a:schemeClr val="tx1"/>
+                          </a:fontRef>
+                        </wps:style>
+                        <wps:bodyPr/>
+                      </wps:wsp>
                     </wpc:wpc>
                   </a:graphicData>
                 </a:graphic>
@@ -159,7 +195,7 @@
           </mc:Choice>
           <mc:Fallback>
             <w:pict>
-              <v:group w14:anchorId="47B3DCE6" id="Zone de dessin 1" o:spid="_x0000_s1026" editas="canvas" style="position:absolute;margin-left:29.15pt;margin-top:4.2pt;width:300pt;height:200pt;z-index:251659264" coordsize="38100,25400" o:gfxdata="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">
+              <v:group w14:anchorId="47B3DCE6" id="Zone de dessin 1" o:spid="_x0000_s1026" editas="canvas" style="position:absolute;margin-left:29.15pt;margin-top:4.2pt;width:300pt;height:200pt;z-index:251659264" coordsize="38100,25400" o:gfxdata="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">
                 <v:shapetype id="_x0000_t75" coordsize="21600,21600" o:spt="75" o:preferrelative="t" path="m@4@5l@4@11@9@11@9@5xe" filled="f" stroked="f">
                   <v:stroke joinstyle="miter"/>
                   <v:formulas>
@@ -213,6 +249,9 @@
                     </v:textbox>
                   </v:rect>
                 </v:group>
+                <v:line id="Connecteur droit 1539593676" o:spid="_x0000_s1031" style="position:absolute;visibility:visible;mso-wrap-style:square" from="8890,8890" to="8890,12700" o:connectortype="straight" o:gfxdata="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" strokecolor="#156082 [3204]" strokeweight="1.5pt">
+                  <v:stroke joinstyle="miter"/>
+                </v:line>
               </v:group>
             </w:pict>
           </mc:Fallback>

</xml_diff>